<commit_message>
Rebuild Resources with dated 2026-27 university letters and monochrome editable templates
</commit_message>
<xml_diff>
--- a/downloads/career-discovery-visit-guide.docx
+++ b/downloads/career-discovery-visit-guide.docx
@@ -2,6 +2,21 @@
 <file path=word/document.xml><?xml version="1.0" encoding="utf-8"?>
 <w:document xmlns:wpc="http://schemas.microsoft.com/office/word/2010/wordprocessingCanvas" xmlns:mo="http://schemas.microsoft.com/office/mac/office/2008/main" xmlns:mc="http://schemas.openxmlformats.org/markup-compatibility/2006" xmlns:mv="urn:schemas-microsoft-com:mac:vml" xmlns:o="urn:schemas-microsoft-com:office:office" xmlns:r="http://schemas.openxmlformats.org/officeDocument/2006/relationships" xmlns:m="http://schemas.openxmlformats.org/officeDocument/2006/math" xmlns:v="urn:schemas-microsoft-com:vml" xmlns:wp14="http://schemas.microsoft.com/office/word/2010/wordprocessingDrawing" xmlns:wp="http://schemas.openxmlformats.org/drawingml/2006/wordprocessingDrawing" xmlns:w10="urn:schemas-microsoft-com:office:word" xmlns:w="http://schemas.openxmlformats.org/wordprocessingml/2006/main" xmlns:w14="http://schemas.microsoft.com/office/word/2010/wordml" xmlns:wpg="http://schemas.microsoft.com/office/word/2010/wordprocessingGroup" xmlns:wpi="http://schemas.microsoft.com/office/word/2010/wordprocessingInk" xmlns:wne="http://schemas.microsoft.com/office/word/2006/wordml" xmlns:wps="http://schemas.microsoft.com/office/word/2010/wordprocessingShape" mc:Ignorable="w14 wp14">
   <w:body>
+    <w:p>
+      <w:pPr>
+        <w:spacing w:before="380" w:after="60"/>
+      </w:pPr>
+      <w:r>
+        <w:rPr>
+          <w:rFonts w:ascii="Georgia" w:hAnsi="Georgia"/>
+          <w:b/>
+          <w:i w:val="0"/>
+          <w:color w:val="000000"/>
+          <w:sz w:val="30"/>
+        </w:rPr>
+        <w:t>Career visit: arrive prepared and follow up</w:t>
+      </w:r>
+    </w:p>
     <w:p>
       <w:pPr>
         <w:spacing w:after="300"/>
@@ -10,39 +25,67 @@
         <w:rPr>
           <w:rFonts w:ascii="Aptos" w:hAnsi="Aptos"/>
           <w:b/>
-          <w:color w:val="9F5F39"/>
-          <w:sz w:val="18"/>
+          <w:i w:val="0"/>
+          <w:color w:val="000000"/>
+          <w:sz w:val="16"/>
         </w:rPr>
-        <w:t>THE JEWISH MUTUAL  /  CAREER DISCOVERY FIELD GUIDE</w:t>
+        <w:t>PROFESSIONAL EXPERIENCE / PARTICIPANT GUIDE</w:t>
       </w:r>
     </w:p>
     <w:p>
       <w:pPr>
-        <w:pStyle w:val="DocTitle"/>
+        <w:spacing w:after="280"/>
+        <w:ind w:left="173"/>
+        <w:pBdr>
+          <w:bottom w:val="single" w:sz="8" w:color="000000" w:space="8"/>
+        </w:pBdr>
       </w:pPr>
       <w:r>
-        <w:t>Make a Career Visit Count</w:t>
+        <w:rPr>
+          <w:rFonts w:ascii="Aptos" w:hAnsi="Aptos"/>
+          <w:b/>
+          <w:i w:val="0"/>
+          <w:color w:val="000000"/>
+          <w:sz w:val="16"/>
+        </w:rPr>
+        <w:t xml:space="preserve">BEFORE SENDING  </w:t>
+      </w:r>
+      <w:r>
+        <w:rPr>
+          <w:rFonts w:ascii="Aptos" w:hAnsi="Aptos"/>
+          <w:b w:val="0"/>
+          <w:i w:val="0"/>
+          <w:color w:val="000000"/>
+          <w:sz w:val="16"/>
+        </w:rPr>
+        <w:t>Use as a preparation guide for an actual, confirmed experience; permission and safety requirements always take priority.</w:t>
+      </w:r>
+    </w:p>
+    <w:p>
+      <w:r>
+        <w:rPr>
+          <w:rFonts w:ascii="Aptos" w:hAnsi="Aptos"/>
+          <w:b w:val="0"/>
+          <w:i w:val="0"/>
+          <w:color w:val="000000"/>
+          <w:sz w:val="21"/>
+        </w:rPr>
+        <w:t>A short workplace experience can be valuable if you prepare specific questions, observe the real work, and follow up with one concrete next step.</w:t>
       </w:r>
     </w:p>
     <w:p>
       <w:pPr>
-        <w:pStyle w:val="DocMinor"/>
+        <w:spacing w:before="200"/>
       </w:pPr>
       <w:r>
-        <w:t>A FIELD GUIDE FOR PROFESSIONAL CONVERSATIONS &amp; WORKPLACE DISCOVERY</w:t>
-      </w:r>
-    </w:p>
-    <w:p>
-      <w:r>
-        <w:t>A good career experience should help you answer a real question about a profession—not simply introduce you to someone with an impressive job title. Use this short guide to prepare, learn, and follow through.</w:t>
-      </w:r>
-    </w:p>
-    <w:p>
-      <w:pPr>
-        <w:pStyle w:val="DocHead"/>
-      </w:pPr>
-      <w:r>
-        <w:t>Before the experience</w:t>
+        <w:rPr>
+          <w:rFonts w:ascii="Aptos" w:hAnsi="Aptos"/>
+          <w:b/>
+          <w:i w:val="0"/>
+          <w:color w:val="000000"/>
+          <w:sz w:val="19"/>
+        </w:rPr>
+        <w:t>BEFORE THE VISIT</w:t>
       </w:r>
     </w:p>
     <w:p>
@@ -51,7 +94,14 @@
         <w:spacing w:after="80"/>
       </w:pPr>
       <w:r>
-        <w:t>Choose one decision you are trying to make: Does this field suit my interests, skills, and priorities?</w:t>
+        <w:rPr>
+          <w:rFonts w:ascii="Aptos" w:hAnsi="Aptos"/>
+          <w:b w:val="0"/>
+          <w:i w:val="0"/>
+          <w:color w:val="000000"/>
+          <w:sz w:val="20"/>
+        </w:rPr>
+        <w:t>Read about the firm’s work. Prepare two informed questions about how projects begin and what the day-to-day work involves.</w:t>
       </w:r>
     </w:p>
     <w:p>
@@ -60,7 +110,14 @@
         <w:spacing w:after="80"/>
       </w:pPr>
       <w:r>
-        <w:t>Research the profession and the host organization; prepare three questions you cannot answer easily online.</w:t>
+        <w:rPr>
+          <w:rFonts w:ascii="Aptos" w:hAnsi="Aptos"/>
+          <w:b w:val="0"/>
+          <w:i w:val="0"/>
+          <w:color w:val="000000"/>
+          <w:sz w:val="20"/>
+        </w:rPr>
+        <w:t>Check location, transportation, arrival time, dress and accessibility needs, and whether photography or note-taking is permitted.</w:t>
       </w:r>
     </w:p>
     <w:p>
@@ -69,15 +126,29 @@
         <w:spacing w:after="80"/>
       </w:pPr>
       <w:r>
-        <w:t>Confirm arrival instructions, accessibility or religious accommodation needs, dress and safety requirements, and photography rules.</w:t>
+        <w:rPr>
+          <w:rFonts w:ascii="Aptos" w:hAnsi="Aptos"/>
+          <w:b w:val="0"/>
+          <w:i w:val="0"/>
+          <w:color w:val="000000"/>
+          <w:sz w:val="20"/>
+        </w:rPr>
+        <w:t>For any Jewish observance or dietary needs, raise practical details early; do not assume a host knows your requirements.</w:t>
       </w:r>
     </w:p>
     <w:p>
       <w:pPr>
-        <w:pStyle w:val="DocHead"/>
+        <w:spacing w:before="200"/>
       </w:pPr>
       <w:r>
-        <w:t>During the experience</w:t>
+        <w:rPr>
+          <w:rFonts w:ascii="Aptos" w:hAnsi="Aptos"/>
+          <w:b/>
+          <w:i w:val="0"/>
+          <w:color w:val="000000"/>
+          <w:sz w:val="19"/>
+        </w:rPr>
+        <w:t>DURING THE EXPERIENCE</w:t>
       </w:r>
     </w:p>
     <w:p>
@@ -86,7 +157,14 @@
         <w:spacing w:after="80"/>
       </w:pPr>
       <w:r>
-        <w:t>Ask what an ordinary week looks like, what skills matter, and what is less visible from the outside.</w:t>
+        <w:rPr>
+          <w:rFonts w:ascii="Aptos" w:hAnsi="Aptos"/>
+          <w:b w:val="0"/>
+          <w:i w:val="0"/>
+          <w:color w:val="000000"/>
+          <w:sz w:val="20"/>
+        </w:rPr>
+        <w:t>Ask what surprised the professional about their field, what skills matter most, and what an entry-level person actually does.</w:t>
       </w:r>
     </w:p>
     <w:p>
@@ -95,7 +173,14 @@
         <w:spacing w:after="80"/>
       </w:pPr>
       <w:r>
-        <w:t>Look at how people collaborate and make decisions, not just what their final product looks like.</w:t>
+        <w:rPr>
+          <w:rFonts w:ascii="Aptos" w:hAnsi="Aptos"/>
+          <w:b w:val="0"/>
+          <w:i w:val="0"/>
+          <w:color w:val="000000"/>
+          <w:sz w:val="20"/>
+        </w:rPr>
+        <w:t>Look for the process, not only the polished result: revisions, constraints, testing, team decisions, and trade-offs.</w:t>
       </w:r>
     </w:p>
     <w:p>
@@ -104,15 +189,29 @@
         <w:spacing w:after="80"/>
       </w:pPr>
       <w:r>
-        <w:t>Respect confidentiality, site policies, and time limits. Never photograph work, clients, or equipment without explicit permission.</w:t>
+        <w:rPr>
+          <w:rFonts w:ascii="Aptos" w:hAnsi="Aptos"/>
+          <w:b w:val="0"/>
+          <w:i w:val="0"/>
+          <w:color w:val="000000"/>
+          <w:sz w:val="20"/>
+        </w:rPr>
+        <w:t>Respect confidentiality and workplace safety; do not handle equipment or photograph materials without permission.</w:t>
       </w:r>
     </w:p>
     <w:p>
       <w:pPr>
-        <w:pStyle w:val="DocHead"/>
+        <w:spacing w:before="200"/>
       </w:pPr>
       <w:r>
-        <w:t>Questions worth asking</w:t>
+        <w:rPr>
+          <w:rFonts w:ascii="Aptos" w:hAnsi="Aptos"/>
+          <w:b/>
+          <w:i w:val="0"/>
+          <w:color w:val="000000"/>
+          <w:sz w:val="19"/>
+        </w:rPr>
+        <w:t>AFTERWARD</w:t>
       </w:r>
     </w:p>
     <w:p>
@@ -121,7 +220,14 @@
         <w:spacing w:after="80"/>
       </w:pPr>
       <w:r>
-        <w:t>Which tasks take the most time, and what problems are most difficult?</w:t>
+        <w:rPr>
+          <w:rFonts w:ascii="Aptos" w:hAnsi="Aptos"/>
+          <w:b w:val="0"/>
+          <w:i w:val="0"/>
+          <w:color w:val="000000"/>
+          <w:sz w:val="20"/>
+        </w:rPr>
+        <w:t>Within two days, send a concise thank-you note referring to one specific thing you learned.</w:t>
       </w:r>
     </w:p>
     <w:p>
@@ -130,7 +236,14 @@
         <w:spacing w:after="80"/>
       </w:pPr>
       <w:r>
-        <w:t>What surprised you most after entering this profession?</w:t>
+        <w:rPr>
+          <w:rFonts w:ascii="Aptos" w:hAnsi="Aptos"/>
+          <w:b w:val="0"/>
+          <w:i w:val="0"/>
+          <w:color w:val="000000"/>
+          <w:sz w:val="20"/>
+        </w:rPr>
+        <w:t>Write down one skill you want to practice or another experience you want to seek.</w:t>
       </w:r>
     </w:p>
     <w:p>
@@ -139,7 +252,29 @@
         <w:spacing w:after="80"/>
       </w:pPr>
       <w:r>
-        <w:t>If you were exploring this field today, what low-cost first step would you recommend?</w:t>
+        <w:rPr>
+          <w:rFonts w:ascii="Aptos" w:hAnsi="Aptos"/>
+          <w:b w:val="0"/>
+          <w:i w:val="0"/>
+          <w:color w:val="000000"/>
+          <w:sz w:val="20"/>
+        </w:rPr>
+        <w:t>If you promised a follow-up or portfolio sample, deliver it on time.</w:t>
+      </w:r>
+    </w:p>
+    <w:p>
+      <w:pPr>
+        <w:spacing w:before="200"/>
+      </w:pPr>
+      <w:r>
+        <w:rPr>
+          <w:rFonts w:ascii="Aptos" w:hAnsi="Aptos"/>
+          <w:b/>
+          <w:i w:val="0"/>
+          <w:color w:val="000000"/>
+          <w:sz w:val="19"/>
+        </w:rPr>
+        <w:t>THREE QUESTIONS TO BRING</w:t>
       </w:r>
     </w:p>
     <w:p>
@@ -148,15 +283,14 @@
         <w:spacing w:after="80"/>
       </w:pPr>
       <w:r>
-        <w:t>What alternative roles use similar skills but have a different daily experience?</w:t>
-      </w:r>
-    </w:p>
-    <w:p>
-      <w:pPr>
-        <w:pStyle w:val="DocHead"/>
-      </w:pPr>
-      <w:r>
-        <w:t>After the experience</w:t>
+        <w:rPr>
+          <w:rFonts w:ascii="Aptos" w:hAnsi="Aptos"/>
+          <w:b w:val="0"/>
+          <w:i w:val="0"/>
+          <w:color w:val="000000"/>
+          <w:sz w:val="20"/>
+        </w:rPr>
+        <w:t>What does a typical week look like, rather than the most exciting project?</w:t>
       </w:r>
     </w:p>
     <w:p>
@@ -165,7 +299,14 @@
         <w:spacing w:after="80"/>
       </w:pPr>
       <w:r>
-        <w:t>Write down three things you learned and one assumption that changed.</w:t>
+        <w:rPr>
+          <w:rFonts w:ascii="Aptos" w:hAnsi="Aptos"/>
+          <w:b w:val="0"/>
+          <w:i w:val="0"/>
+          <w:color w:val="000000"/>
+          <w:sz w:val="20"/>
+        </w:rPr>
+        <w:t>What mistakes or misconceptions do newcomers usually have?</w:t>
       </w:r>
     </w:p>
     <w:p>
@@ -174,35 +315,21 @@
         <w:spacing w:after="80"/>
       </w:pPr>
       <w:r>
-        <w:t>Decide on a concrete next action, such as a course, informational interview, portfolio experiment, or further visit.</w:t>
-      </w:r>
-    </w:p>
-    <w:p>
-      <w:pPr>
-        <w:pStyle w:val="ListBullet"/>
-        <w:spacing w:after="80"/>
-      </w:pPr>
-      <w:r>
-        <w:t>Send a concise thank-you note directly to the host using your own words.</w:t>
-      </w:r>
-    </w:p>
-    <w:p>
-      <w:pPr>
-        <w:spacing w:before="240"/>
-      </w:pPr>
-      <w:r>
         <w:rPr>
-          <w:i/>
-          <w:color w:val="5A6F77"/>
-          <w:sz w:val="16"/>
+          <w:rFonts w:ascii="Aptos" w:hAnsi="Aptos"/>
+          <w:b w:val="0"/>
+          <w:i w:val="0"/>
+          <w:color w:val="000000"/>
+          <w:sz w:val="20"/>
         </w:rPr>
-        <w:t>This guide is educational. Participation in a workplace visit requires host approval and compliance with applicable safety, confidentiality, and access rules.</w:t>
+        <w:t>What small project could I try to see whether I enjoy this work?</w:t>
       </w:r>
     </w:p>
     <w:sectPr>
-      <w:footerReference w:type="default" r:id="rId9"/>
+      <w:headerReference w:type="default" r:id="rId9"/>
+      <w:footerReference w:type="default" r:id="rId10"/>
       <w:pgSz w:w="12240" w:h="15840"/>
-      <w:pgMar w:top="1181" w:right="1253" w:bottom="1109" w:left="1253" w:header="720" w:footer="720" w:gutter="0"/>
+      <w:pgMar w:top="1224" w:right="1498" w:bottom="1008" w:left="1498" w:header="504" w:footer="533" w:gutter="0"/>
       <w:cols w:space="720"/>
       <w:docGrid w:linePitch="360"/>
     </w:sectPr>
@@ -215,17 +342,69 @@
   <w:p>
     <w:pPr>
       <w:pStyle w:val="Footer"/>
-      <w:jc w:val="right"/>
+      <w:jc w:val="center"/>
     </w:pPr>
     <w:r>
       <w:rPr>
-        <w:color w:val="5A6F77"/>
+        <w:rFonts w:ascii="Aptos" w:hAnsi="Aptos"/>
+        <w:b w:val="0"/>
+        <w:i w:val="0"/>
+        <w:color w:val="000000"/>
         <w:sz w:val="14"/>
       </w:rPr>
-      <w:t>THE JEWISH MUTUAL  ·  PRACTICAL RESOURCES  ·  OCTOBER 2026</w:t>
+      <w:t>THE JEWISH MUTUAL   |   Free adaptable sample   |   Not an official verification of observance</w:t>
     </w:r>
   </w:p>
 </w:ftr>
+</file>
+
+<file path=word/header1.xml><?xml version="1.0" encoding="utf-8"?>
+<w:hdr xmlns:m="http://schemas.openxmlformats.org/officeDocument/2006/math" xmlns:mc="http://schemas.openxmlformats.org/markup-compatibility/2006" xmlns:mo="http://schemas.microsoft.com/office/mac/office/2008/main" xmlns:mv="urn:schemas-microsoft-com:mac:vml" xmlns:o="urn:schemas-microsoft-com:office:office" xmlns:r="http://schemas.openxmlformats.org/officeDocument/2006/relationships" xmlns:v="urn:schemas-microsoft-com:vml" xmlns:w10="urn:schemas-microsoft-com:office:word" xmlns:w14="http://schemas.microsoft.com/office/word/2010/wordml" xmlns:w="http://schemas.openxmlformats.org/wordprocessingml/2006/main" xmlns:wne="http://schemas.microsoft.com/office/word/2006/wordml" xmlns:wp14="http://schemas.microsoft.com/office/word/2010/wordprocessingDrawing" xmlns:wp="http://schemas.openxmlformats.org/drawingml/2006/wordprocessingDrawing" xmlns:wpc="http://schemas.microsoft.com/office/word/2010/wordprocessingCanvas" xmlns:wpg="http://schemas.microsoft.com/office/word/2010/wordprocessingGroup" xmlns:wpi="http://schemas.microsoft.com/office/word/2010/wordprocessingInk" xmlns:wps="http://schemas.microsoft.com/office/word/2010/wordprocessingShape" mc:Ignorable="w14 wp14">
+  <w:p>
+    <w:pPr>
+      <w:pStyle w:val="Header"/>
+      <w:spacing w:after="80"/>
+    </w:pPr>
+    <w:r>
+      <w:rPr>
+        <w:rFonts w:ascii="Georgia" w:hAnsi="Georgia"/>
+        <w:b/>
+        <w:i w:val="0"/>
+        <w:color w:val="000000"/>
+        <w:sz w:val="42"/>
+      </w:rPr>
+      <w:t>J</w:t>
+    </w:r>
+    <w:r>
+      <w:rPr>
+        <w:rFonts w:ascii="Georgia" w:hAnsi="Georgia"/>
+        <w:b/>
+        <w:i w:val="0"/>
+        <w:color w:val="000000"/>
+        <w:sz w:val="28"/>
+      </w:rPr>
+      <w:t xml:space="preserve">  THE JEWISH MUTUAL</w:t>
+    </w:r>
+  </w:p>
+  <w:p>
+    <w:pPr>
+      <w:spacing w:after="120"/>
+      <w:pBdr>
+        <w:bottom w:val="single" w:sz="8" w:color="000000" w:space="8"/>
+      </w:pBdr>
+    </w:pPr>
+    <w:r>
+      <w:rPr>
+        <w:rFonts w:ascii="Aptos" w:hAnsi="Aptos"/>
+        <w:b/>
+        <w:i w:val="0"/>
+        <w:color w:val="000000"/>
+        <w:sz w:val="15"/>
+      </w:rPr>
+      <w:t>EDUCATIONAL &amp; PROFESSIONAL RESOURCES  /  UNITED STATES</w:t>
+    </w:r>
+  </w:p>
+</w:hdr>
 </file>
 
 <file path=word/numbering.xml><?xml version="1.0" encoding="utf-8"?>
@@ -592,11 +771,11 @@
     <w:qFormat/>
     <w:rsid w:val="00FC693F"/>
     <w:pPr>
-      <w:spacing w:after="180" w:line="281" w:lineRule="auto"/>
+      <w:spacing w:after="140" w:line="264" w:lineRule="auto"/>
     </w:pPr>
     <w:rPr>
       <w:rFonts w:ascii="Aptos" w:hAnsi="Aptos"/>
-      <w:color w:val="1C303A"/>
+      <w:color w:val="000000"/>
       <w:sz w:val="21"/>
     </w:rPr>
   </w:style>
@@ -659,11 +838,11 @@
       <w:outlineLvl w:val="0"/>
     </w:pPr>
     <w:rPr>
-      <w:rFonts w:asciiTheme="majorHAnsi" w:eastAsiaTheme="majorEastAsia" w:hAnsiTheme="majorHAnsi" w:cstheme="majorBidi"/>
+      <w:rFonts w:asciiTheme="majorHAnsi" w:eastAsiaTheme="majorEastAsia" w:hAnsiTheme="majorHAnsi" w:cstheme="majorBidi" w:ascii="Aptos" w:hAnsi="Aptos"/>
       <w:b/>
       <w:bCs/>
-      <w:color w:val="365F91" w:themeColor="accent1" w:themeShade="BF"/>
-      <w:sz w:val="28"/>
+      <w:color w:val="000000"/>
+      <w:sz w:val="22"/>
       <w:szCs w:val="28"/>
     </w:rPr>
   </w:style>
@@ -948,11 +1127,12 @@
       <w:contextualSpacing/>
     </w:pPr>
     <w:rPr>
-      <w:rFonts w:asciiTheme="majorHAnsi" w:eastAsiaTheme="majorEastAsia" w:hAnsiTheme="majorHAnsi" w:cstheme="majorBidi"/>
-      <w:color w:val="17365D" w:themeColor="text2" w:themeShade="BF"/>
+      <w:rFonts w:asciiTheme="majorHAnsi" w:eastAsiaTheme="majorEastAsia" w:hAnsiTheme="majorHAnsi" w:cstheme="majorBidi" w:ascii="Georgia" w:hAnsi="Georgia"/>
+      <w:b/>
+      <w:color w:val="000000"/>
       <w:spacing w:val="5"/>
       <w:kern w:val="28"/>
-      <w:sz w:val="52"/>
+      <w:sz w:val="28"/>
       <w:szCs w:val="52"/>
     </w:rPr>
   </w:style>
@@ -12281,45 +12461,6 @@
         <w:shd w:val="clear" w:color="auto" w:fill="FBCAA2" w:themeFill="accent6" w:themeFillTint="7F"/>
       </w:tcPr>
     </w:tblStylePr>
-  </w:style>
-  <w:style w:type="paragraph" w:customStyle="1" w:styleId="DocTitle">
-    <w:name w:val="DocTitle"/>
-    <w:basedOn w:val="Normal"/>
-    <w:pPr>
-      <w:spacing w:before="60" w:after="160"/>
-    </w:pPr>
-    <w:rPr>
-      <w:rFonts w:ascii="Georgia" w:hAnsi="Georgia"/>
-      <w:b w:val="0"/>
-      <w:color w:val="1C303A"/>
-      <w:sz w:val="48"/>
-    </w:rPr>
-  </w:style>
-  <w:style w:type="paragraph" w:customStyle="1" w:styleId="DocHead">
-    <w:name w:val="DocHead"/>
-    <w:basedOn w:val="Normal"/>
-    <w:pPr>
-      <w:spacing w:before="200" w:after="160"/>
-    </w:pPr>
-    <w:rPr>
-      <w:rFonts w:ascii="Aptos" w:hAnsi="Aptos"/>
-      <w:b/>
-      <w:color w:val="1C303A"/>
-      <w:sz w:val="26"/>
-    </w:rPr>
-  </w:style>
-  <w:style w:type="paragraph" w:customStyle="1" w:styleId="DocMinor">
-    <w:name w:val="DocMinor"/>
-    <w:basedOn w:val="Normal"/>
-    <w:pPr>
-      <w:spacing w:before="200" w:after="160"/>
-    </w:pPr>
-    <w:rPr>
-      <w:rFonts w:ascii="Aptos" w:hAnsi="Aptos"/>
-      <w:b/>
-      <w:color w:val="9F5F39"/>
-      <w:sz w:val="20"/>
-    </w:rPr>
   </w:style>
 </w:styles>
 </file>

</xml_diff>